<commit_message>
feat(desktop): add verified tauri sidecar
</commit_message>
<xml_diff>
--- a/LifeOS Leitfaden.docx
+++ b/LifeOS Leitfaden.docx
@@ -60,12 +60,7 @@
         </w:rPr>
       </w:pPr>
       <w:r>
-        <w:rPr>
-          <w:b/>
-          <w:color w:val="0B2545"/>
-          <w:lang w:val="de-DE"/>
-        </w:rPr>
-        <w:t>Version 0.1 (Entwurf)</w:t>
+        <w:t>Version 0.2 (Entwurf)</w:t>
       </w:r>
     </w:p>
     <w:p>
@@ -77,12 +72,7 @@
         </w:rPr>
       </w:pPr>
       <w:r>
-        <w:rPr>
-          <w:color w:val="667085"/>
-          <w:sz w:val="21"/>
-          <w:lang w:val="de-DE"/>
-        </w:rPr>
-        <w:t>Stand: 18.07.2026</w:t>
+        <w:t>Stand: 09.08.2026</w:t>
       </w:r>
     </w:p>
     <w:p>
@@ -174,23 +164,17 @@
         </w:rPr>
       </w:pPr>
       <w:r>
-        <w:rPr>
-          <w:lang w:val="de-DE"/>
-        </w:rPr>
-        <w:t xml:space="preserve">Version: 0.1 (Entwurf)  </w:t>
-      </w:r>
-    </w:p>
-    <w:p>
-      <w:pPr>
-        <w:rPr>
-          <w:lang w:val="de-DE"/>
-        </w:rPr>
-      </w:pPr>
-      <w:r>
-        <w:rPr>
-          <w:lang w:val="de-DE"/>
-        </w:rPr>
-        <w:t xml:space="preserve">Stand: 18.07.2026  </w:t>
+        <w:t>Version: 0.2 (Entwurf)</w:t>
+      </w:r>
+    </w:p>
+    <w:p>
+      <w:pPr>
+        <w:rPr>
+          <w:lang w:val="de-DE"/>
+        </w:rPr>
+      </w:pPr>
+      <w:r>
+        <w:t>Stand: 09.08.2026</w:t>
       </w:r>
     </w:p>
     <w:p>
@@ -13911,13 +13895,42 @@
         <w:spacing w:after="80"/>
         <w:ind w:hanging="271"/>
       </w:pPr>
+      <w:r>
+        <w:t>Datenbank: SQLite im lokalen Mac-App-Betrieb; PostgreSQL bleibt Entwicklungs-, Import- und Rückfallpfad, bis Installation und Updates vollständig nachgewiesen sind.</w:t>
+      </w:r>
+    </w:p>
+    <w:p>
+      <w:pPr>
+        <w:numPr>
+          <w:ilvl w:val="0"/>
+          <w:numId w:val="47"/>
+        </w:numPr>
+        <w:spacing w:after="80"/>
+        <w:ind w:hanging="271"/>
+      </w:pPr>
+      <w:r>
+        <w:t>Lokaler Betrieb: Tauri 2 startet die bestehende React-Oberfläche und das Node-/Express-Backend als gebündelten Sidecar ohne Docker oder separat installiertes Node.js. Docker Compose bleibt für PostgreSQL-Entwicklung und Tests verfügbar.</w:t>
+      </w:r>
+    </w:p>
+    <w:p>
+      <w:pPr>
+        <w:numPr>
+          <w:ilvl w:val="0"/>
+          <w:numId w:val="47"/>
+        </w:numPr>
+        <w:spacing w:after="80"/>
+        <w:ind w:hanging="271"/>
+      </w:pPr>
+      <w:r>
+        <w:t xml:space="preserve">Tests: Unit-, Integrations- und </w:t>
+      </w:r>
       <w:proofErr w:type="spellStart"/>
       <w:r>
-        <w:t>Datenbank</w:t>
+        <w:t>ausgewählte</w:t>
       </w:r>
       <w:proofErr w:type="spellEnd"/>
       <w:r>
-        <w:t>: PostgreSQL.</w:t>
+        <w:t xml:space="preserve"> End-to-End-Tests.</w:t>
       </w:r>
     </w:p>
     <w:p>
@@ -13928,53 +13941,6 @@
         </w:numPr>
         <w:spacing w:after="80"/>
         <w:ind w:hanging="271"/>
-      </w:pPr>
-      <w:proofErr w:type="spellStart"/>
-      <w:r>
-        <w:t>Lokale</w:t>
-      </w:r>
-      <w:proofErr w:type="spellEnd"/>
-      <w:r>
-        <w:t xml:space="preserve"> </w:t>
-      </w:r>
-      <w:proofErr w:type="spellStart"/>
-      <w:r>
-        <w:t>Entwicklung</w:t>
-      </w:r>
-      <w:proofErr w:type="spellEnd"/>
-      <w:r>
-        <w:t>: Docker Compose.</w:t>
-      </w:r>
-    </w:p>
-    <w:p>
-      <w:pPr>
-        <w:numPr>
-          <w:ilvl w:val="0"/>
-          <w:numId w:val="47"/>
-        </w:numPr>
-        <w:spacing w:after="80"/>
-        <w:ind w:hanging="271"/>
-      </w:pPr>
-      <w:r>
-        <w:t xml:space="preserve">Tests: Unit-, Integrations- und </w:t>
-      </w:r>
-      <w:proofErr w:type="spellStart"/>
-      <w:r>
-        <w:t>ausgewählte</w:t>
-      </w:r>
-      <w:proofErr w:type="spellEnd"/>
-      <w:r>
-        <w:t xml:space="preserve"> End-to-End-Tests.</w:t>
-      </w:r>
-    </w:p>
-    <w:p>
-      <w:pPr>
-        <w:numPr>
-          <w:ilvl w:val="0"/>
-          <w:numId w:val="47"/>
-        </w:numPr>
-        <w:spacing w:after="80"/>
-        <w:ind w:hanging="271"/>
         <w:rPr>
           <w:lang w:val="de-DE"/>
         </w:rPr>
@@ -13984,6 +13950,29 @@
           <w:lang w:val="de-DE"/>
         </w:rPr>
         <w:t>Dokumente: lokaler Speicher im MVP, abstrakte Storage-Schnittstelle für später.</w:t>
+      </w:r>
+    </w:p>
+    <w:p>
+      <w:pPr>
+        <w:pStyle w:val="Heading2"/>
+      </w:pPr>
+      <w:r>
+        <w:t>Bestätigter Mac-App-Prototyp (M5)</w:t>
+      </w:r>
+    </w:p>
+    <w:p>
+      <w:r>
+        <w:t>Der geprüfte Prototyp bündelt die bestehende Weboberfläche, die API, SQLite-Migrationen und eine fest auf Version 22.23.2 gesetzte offizielle Node.js-Laufzeit in einer macOS-ARM64-App. Weboberfläche, API und CalDAV verwenden denselben dynamischen Loopback-Port; Anwendungsdaten und Protokolle erhalten private Dateirechte.</w:t>
+      </w:r>
+    </w:p>
+    <w:p>
+      <w:r>
+        <w:t>Nachgewiesen: Die erzeugte .app startet ohne Docker und ohne Node.js aus der Entwicklungsumgebung, zeigt die LifeOS-Anmeldung, initialisiert SQLite automatisch und beendet den Sidecar geordnet.</w:t>
+      </w:r>
+    </w:p>
+    <w:p>
+      <w:r>
+        <w:t>Noch offen für M6: Developer-ID-Signatur und Apple-Notarisierung, DMG-Installation, terminalfreie Ersteinrichtung, Update- und Rollback-Nachweis sowie der Test auf einem sauberen unterstützten Mac.</w:t>
       </w:r>
     </w:p>
     <w:p>
@@ -14328,6 +14317,11 @@
           <w:lang w:val="de-DE"/>
         </w:rPr>
         <w:t>Dokumentstatus: Arbeitsgrundlage für Produktentscheidungen und inkrementelle Entwicklung. Änderungen sollten mit Versionsstand, Datum und kurzer Begründung ergänzt werden.</w:t>
+      </w:r>
+    </w:p>
+    <w:p>
+      <w:r>
+        <w:t>Änderungsstand 09.08.2026: Der verifizierte M5-Prototyp der lokalen Mac-App mit Tauri, gebündeltem Node-Sidecar und SQLite wurde in den technischen Leitplanken ergänzt. Noch nicht nachgewiesene Distributionsschritte bleiben ausdrücklich als offen markiert.</w:t>
       </w:r>
     </w:p>
     <w:p>
@@ -14403,7 +14397,7 @@
         <w:color w:val="667085"/>
         <w:sz w:val="18"/>
       </w:rPr>
-      <w:t>0.1  |</w:t>
+      <w:t>0.2  |</w:t>
     </w:r>
     <w:proofErr w:type="gramEnd"/>
     <w:r>

</xml_diff>

<commit_message>
feat(desktop): add local mac installation flow
</commit_message>
<xml_diff>
--- a/LifeOS Leitfaden.docx
+++ b/LifeOS Leitfaden.docx
@@ -13896,7 +13896,7 @@
         <w:ind w:hanging="271"/>
       </w:pPr>
       <w:r>
-        <w:t>Datenbank: SQLite im lokalen Mac-App-Betrieb; PostgreSQL bleibt Entwicklungs-, Import- und Rückfallpfad, bis Installation und Updates vollständig nachgewiesen sind.</w:t>
+        <w:t>Datenbank: SQLite im lokalen Mac-App-Betrieb; PostgreSQL bleibt Entwicklungs- und ausdrücklicher Rückfallpfad, bis die öffentliche Release-Freigabe und eine echte persönliche Datenübernahme abgeschlossen sind.</w:t>
       </w:r>
     </w:p>
     <w:p>
@@ -13957,22 +13957,22 @@
         <w:pStyle w:val="Heading2"/>
       </w:pPr>
       <w:r>
-        <w:t>Bestätigter Mac-App-Prototyp (M5)</w:t>
-      </w:r>
-    </w:p>
-    <w:p>
-      <w:r>
-        <w:t>Der geprüfte Prototyp bündelt die bestehende Weboberfläche, die API, SQLite-Migrationen und eine fest auf Version 22.23.2 gesetzte offizielle Node.js-Laufzeit in einer macOS-ARM64-App. Weboberfläche, API und CalDAV verwenden denselben dynamischen Loopback-Port; Anwendungsdaten und Protokolle erhalten private Dateirechte.</w:t>
-      </w:r>
-    </w:p>
-    <w:p>
-      <w:r>
-        <w:t>Nachgewiesen: Die erzeugte .app startet ohne Docker und ohne Node.js aus der Entwicklungsumgebung, zeigt die LifeOS-Anmeldung, initialisiert SQLite automatisch und beendet den Sidecar geordnet.</w:t>
-      </w:r>
-    </w:p>
-    <w:p>
-      <w:r>
-        <w:t>Noch offen für M6: Developer-ID-Signatur und Apple-Notarisierung, DMG-Installation, terminalfreie Ersteinrichtung, Update- und Rollback-Nachweis sowie der Test auf einem sauberen unterstützten Mac.</w:t>
+        <w:t>Bestätigter Mac-App- und lokaler Installationsnachweis (M5/M6)</w:t>
+      </w:r>
+    </w:p>
+    <w:p>
+      <w:r>
+        <w:t>Die geprüfte ARM64-App bündelt die bestehende Weboberfläche, die API, SQLite-Migrationen und eine fest auf Version 22.23.2 gesetzte offizielle Node.js-Laufzeit. Weboberfläche, API und CalDAV verwenden denselben dynamischen Loopback-Port; Anwendungsdaten und Protokolle erhalten private Dateirechte.</w:t>
+      </w:r>
+    </w:p>
+    <w:p>
+      <w:r>
+        <w:t>Lokal nachgewiesen: Das geprüfte DMG enthält App und Programme-Link. Die daraus kopierte App startet ohne Docker und ohne separat installiertes Node.js, richtet Profil sowie getrennte App- und CalDAV-Zugänge ohne Terminal ein und beendet den Sidecar geordnet. Update, Rollback, Backup und Restore erhielten stabile Benutzer-, Kalender- und Ereignisidentitäten. Das anschließende Entfernen der isolierten App-Kopien ließ Nutzerdaten und Update-Backup unangetastet. Die Fachparität wurde mit jeweils 47 API-Tests auf SQLite und PostgreSQL sowie ergänzenden Datenbank-, Web-, Browser-, Desktop- und Repository-Prüfungen bestätigt. Die SHA-256-Prüfsumme des finalen lokalen DMG lautet 96563589782571789fe40d7a996b1141a21ef95fe50372300ed73964550abf73.</w:t>
+      </w:r>
+    </w:p>
+    <w:p>
+      <w:r>
+        <w:t>Noch offene Release-Gates: Developer-ID-Signatur, Apple-Notarisierung, Gegencheck auf einem zweiten sauberen unterstützten Mac, Intel- oder Universal-Build und physischer Apple-Kalender-Test über ein abgesichertes LAN.</w:t>
       </w:r>
     </w:p>
     <w:p>
@@ -14321,7 +14321,7 @@
     </w:p>
     <w:p>
       <w:r>
-        <w:t>Änderungsstand 09.08.2026: Der verifizierte M5-Prototyp der lokalen Mac-App mit Tauri, gebündeltem Node-Sidecar und SQLite wurde in den technischen Leitplanken ergänzt. Noch nicht nachgewiesene Distributionsschritte bleiben ausdrücklich als offen markiert.</w:t>
+        <w:t>Änderungsstand 09.08.2026: Der verifizierte M5-Prototyp und der lokale M6-Nachweis für DMG, Ersteinrichtung, Update, Rollback, Backup und Restore wurden ergänzt. Noch nicht nachgewiesene externe Release-Schritte bleiben ausdrücklich als offen markiert.</w:t>
       </w:r>
     </w:p>
     <w:p>

</xml_diff>

<commit_message>
docs(desktop): finalize local migration status
</commit_message>
<xml_diff>
--- a/LifeOS Leitfaden.docx
+++ b/LifeOS Leitfaden.docx
@@ -13967,12 +13967,12 @@
     </w:p>
     <w:p>
       <w:r>
-        <w:t>Lokal nachgewiesen: Das geprüfte DMG enthält App und Programme-Link. Die daraus kopierte App startet ohne Docker und ohne separat installiertes Node.js, richtet Profil sowie getrennte App- und CalDAV-Zugänge ohne Terminal ein und beendet den Sidecar geordnet. Update, Rollback, Backup und Restore erhielten stabile Benutzer-, Kalender- und Ereignisidentitäten. Das anschließende Entfernen der isolierten App-Kopien ließ Nutzerdaten und Update-Backup unangetastet. Die Fachparität wurde mit jeweils 47 API-Tests auf SQLite und PostgreSQL sowie ergänzenden Datenbank-, Web-, Browser-, Desktop- und Repository-Prüfungen bestätigt. Die SHA-256-Prüfsumme des finalen lokalen DMG lautet 96563589782571789fe40d7a996b1141a21ef95fe50372300ed73964550abf73.</w:t>
-      </w:r>
-    </w:p>
-    <w:p>
-      <w:r>
-        <w:t>Noch offene Release-Gates: Developer-ID-Signatur, Apple-Notarisierung, Gegencheck auf einem zweiten sauberen unterstützten Mac, Intel- oder Universal-Build und physischer Apple-Kalender-Test über ein abgesichertes LAN.</w:t>
+        <w:t>Lokal nachgewiesen: Das geprüfte DMG enthält App und Programme-Link. Die daraus kopierte App startet ohne Docker und ohne separat installiertes Node.js, richtet Profil sowie getrennte App- und CalDAV-Zugänge ohne Terminal ein und beendet den Sidecar geordnet. Update, Rollback, Backup und Restore erhielten stabile Benutzer-, Kalender- und Ereignisidentitäten. Das anschließende Entfernen der isolierten App-Kopien ließ Nutzerdaten und Update-Backup unangetastet. Die Fachparität wurde mit jeweils 47 API-Tests auf SQLite und PostgreSQL sowie ergänzenden Datenbank-, Web-, Browser-, Desktop- und Repository-Prüfungen bestätigt. Die SHA-256-Prüfsumme des zuletzt geprüften lokalen DMG lautet 9648de7f17294e3619b66772c87c26703e336460c6c55a54237e50cc8207c913.</w:t>
+      </w:r>
+    </w:p>
+    <w:p>
+      <w:r>
+        <w:t>M6 ist lokal erfolgreich; die öffentliche Produktfreigabe ist aufgeschoben. Offen bleiben Developer-ID-Signatur, Apple-Notarisierung, Gegencheck auf einem zweiten sauberen unterstützten Mac, Intel- oder Universal-Build und physischer Apple-Kalender-Test über ein abgesichertes LAN.</w:t>
       </w:r>
     </w:p>
     <w:p>
@@ -14321,7 +14321,7 @@
     </w:p>
     <w:p>
       <w:r>
-        <w:t>Änderungsstand 09.08.2026: Der verifizierte M5-Prototyp und der lokale M6-Nachweis für DMG, Ersteinrichtung, Update, Rollback, Backup und Restore wurden ergänzt. Noch nicht nachgewiesene externe Release-Schritte bleiben ausdrücklich als offen markiert.</w:t>
+        <w:t>Änderungsstand 11.08.2026: Der verifizierte M5-Prototyp und der lokal erfolgreiche M6-Nachweis für DMG, Ersteinrichtung, Update, Rollback, Backup, Restore und Deinstallation wurden ergänzt. Die öffentliche Produktfreigabe und ihre externen Release-Gates bleiben ausdrücklich aufgeschoben.</w:t>
       </w:r>
     </w:p>
     <w:p>

</xml_diff>

<commit_message>
feat(desktop): migrate local Mac app runtime to SQLite (#54)
Bündelt die geprüfte Tauri-Mac-App, SQLite-Laufzeit, Migration, Import, Backup/Restore und lokale DMG-Nachweise.
</commit_message>
<xml_diff>
--- a/LifeOS Leitfaden.docx
+++ b/LifeOS Leitfaden.docx
@@ -60,12 +60,7 @@
         </w:rPr>
       </w:pPr>
       <w:r>
-        <w:rPr>
-          <w:b/>
-          <w:color w:val="0B2545"/>
-          <w:lang w:val="de-DE"/>
-        </w:rPr>
-        <w:t>Version 0.1 (Entwurf)</w:t>
+        <w:t>Version 0.2 (Entwurf)</w:t>
       </w:r>
     </w:p>
     <w:p>
@@ -77,12 +72,7 @@
         </w:rPr>
       </w:pPr>
       <w:r>
-        <w:rPr>
-          <w:color w:val="667085"/>
-          <w:sz w:val="21"/>
-          <w:lang w:val="de-DE"/>
-        </w:rPr>
-        <w:t>Stand: 18.07.2026</w:t>
+        <w:t>Stand: 09.08.2026</w:t>
       </w:r>
     </w:p>
     <w:p>
@@ -174,23 +164,17 @@
         </w:rPr>
       </w:pPr>
       <w:r>
-        <w:rPr>
-          <w:lang w:val="de-DE"/>
-        </w:rPr>
-        <w:t xml:space="preserve">Version: 0.1 (Entwurf)  </w:t>
-      </w:r>
-    </w:p>
-    <w:p>
-      <w:pPr>
-        <w:rPr>
-          <w:lang w:val="de-DE"/>
-        </w:rPr>
-      </w:pPr>
-      <w:r>
-        <w:rPr>
-          <w:lang w:val="de-DE"/>
-        </w:rPr>
-        <w:t xml:space="preserve">Stand: 18.07.2026  </w:t>
+        <w:t>Version: 0.2 (Entwurf)</w:t>
+      </w:r>
+    </w:p>
+    <w:p>
+      <w:pPr>
+        <w:rPr>
+          <w:lang w:val="de-DE"/>
+        </w:rPr>
+      </w:pPr>
+      <w:r>
+        <w:t>Stand: 09.08.2026</w:t>
       </w:r>
     </w:p>
     <w:p>
@@ -13911,13 +13895,42 @@
         <w:spacing w:after="80"/>
         <w:ind w:hanging="271"/>
       </w:pPr>
+      <w:r>
+        <w:t>Datenbank: SQLite im lokalen Mac-App-Betrieb; PostgreSQL bleibt Entwicklungs- und ausdrücklicher Rückfallpfad, bis die öffentliche Release-Freigabe und eine echte persönliche Datenübernahme abgeschlossen sind.</w:t>
+      </w:r>
+    </w:p>
+    <w:p>
+      <w:pPr>
+        <w:numPr>
+          <w:ilvl w:val="0"/>
+          <w:numId w:val="47"/>
+        </w:numPr>
+        <w:spacing w:after="80"/>
+        <w:ind w:hanging="271"/>
+      </w:pPr>
+      <w:r>
+        <w:t>Lokaler Betrieb: Tauri 2 startet die bestehende React-Oberfläche und das Node-/Express-Backend als gebündelten Sidecar ohne Docker oder separat installiertes Node.js. Docker Compose bleibt für PostgreSQL-Entwicklung und Tests verfügbar.</w:t>
+      </w:r>
+    </w:p>
+    <w:p>
+      <w:pPr>
+        <w:numPr>
+          <w:ilvl w:val="0"/>
+          <w:numId w:val="47"/>
+        </w:numPr>
+        <w:spacing w:after="80"/>
+        <w:ind w:hanging="271"/>
+      </w:pPr>
+      <w:r>
+        <w:t xml:space="preserve">Tests: Unit-, Integrations- und </w:t>
+      </w:r>
       <w:proofErr w:type="spellStart"/>
       <w:r>
-        <w:t>Datenbank</w:t>
+        <w:t>ausgewählte</w:t>
       </w:r>
       <w:proofErr w:type="spellEnd"/>
       <w:r>
-        <w:t>: PostgreSQL.</w:t>
+        <w:t xml:space="preserve"> End-to-End-Tests.</w:t>
       </w:r>
     </w:p>
     <w:p>
@@ -13928,53 +13941,6 @@
         </w:numPr>
         <w:spacing w:after="80"/>
         <w:ind w:hanging="271"/>
-      </w:pPr>
-      <w:proofErr w:type="spellStart"/>
-      <w:r>
-        <w:t>Lokale</w:t>
-      </w:r>
-      <w:proofErr w:type="spellEnd"/>
-      <w:r>
-        <w:t xml:space="preserve"> </w:t>
-      </w:r>
-      <w:proofErr w:type="spellStart"/>
-      <w:r>
-        <w:t>Entwicklung</w:t>
-      </w:r>
-      <w:proofErr w:type="spellEnd"/>
-      <w:r>
-        <w:t>: Docker Compose.</w:t>
-      </w:r>
-    </w:p>
-    <w:p>
-      <w:pPr>
-        <w:numPr>
-          <w:ilvl w:val="0"/>
-          <w:numId w:val="47"/>
-        </w:numPr>
-        <w:spacing w:after="80"/>
-        <w:ind w:hanging="271"/>
-      </w:pPr>
-      <w:r>
-        <w:t xml:space="preserve">Tests: Unit-, Integrations- und </w:t>
-      </w:r>
-      <w:proofErr w:type="spellStart"/>
-      <w:r>
-        <w:t>ausgewählte</w:t>
-      </w:r>
-      <w:proofErr w:type="spellEnd"/>
-      <w:r>
-        <w:t xml:space="preserve"> End-to-End-Tests.</w:t>
-      </w:r>
-    </w:p>
-    <w:p>
-      <w:pPr>
-        <w:numPr>
-          <w:ilvl w:val="0"/>
-          <w:numId w:val="47"/>
-        </w:numPr>
-        <w:spacing w:after="80"/>
-        <w:ind w:hanging="271"/>
         <w:rPr>
           <w:lang w:val="de-DE"/>
         </w:rPr>
@@ -13984,6 +13950,29 @@
           <w:lang w:val="de-DE"/>
         </w:rPr>
         <w:t>Dokumente: lokaler Speicher im MVP, abstrakte Storage-Schnittstelle für später.</w:t>
+      </w:r>
+    </w:p>
+    <w:p>
+      <w:pPr>
+        <w:pStyle w:val="Heading2"/>
+      </w:pPr>
+      <w:r>
+        <w:t>Bestätigter Mac-App- und lokaler Installationsnachweis (M5/M6)</w:t>
+      </w:r>
+    </w:p>
+    <w:p>
+      <w:r>
+        <w:t>Die geprüfte ARM64-App bündelt die bestehende Weboberfläche, die API, SQLite-Migrationen und eine fest auf Version 22.23.2 gesetzte offizielle Node.js-Laufzeit. Weboberfläche, API und CalDAV verwenden denselben dynamischen Loopback-Port; Anwendungsdaten und Protokolle erhalten private Dateirechte.</w:t>
+      </w:r>
+    </w:p>
+    <w:p>
+      <w:r>
+        <w:t>Lokal nachgewiesen: Das geprüfte DMG enthält App und Programme-Link. Die daraus kopierte App startet ohne Docker und ohne separat installiertes Node.js, richtet Profil sowie getrennte App- und CalDAV-Zugänge ohne Terminal ein und beendet den Sidecar geordnet. Update, Rollback, Backup und Restore erhielten stabile Benutzer-, Kalender- und Ereignisidentitäten. Das anschließende Entfernen der isolierten App-Kopien ließ Nutzerdaten und Update-Backup unangetastet. Die Fachparität wurde mit jeweils 47 API-Tests auf SQLite und PostgreSQL sowie ergänzenden Datenbank-, Web-, Browser-, Desktop- und Repository-Prüfungen bestätigt. Die SHA-256-Prüfsumme des zuletzt geprüften lokalen DMG lautet 9648de7f17294e3619b66772c87c26703e336460c6c55a54237e50cc8207c913.</w:t>
+      </w:r>
+    </w:p>
+    <w:p>
+      <w:r>
+        <w:t>M6 ist lokal erfolgreich; die öffentliche Produktfreigabe ist aufgeschoben. Offen bleiben Developer-ID-Signatur, Apple-Notarisierung, Gegencheck auf einem zweiten sauberen unterstützten Mac, Intel- oder Universal-Build und physischer Apple-Kalender-Test über ein abgesichertes LAN.</w:t>
       </w:r>
     </w:p>
     <w:p>
@@ -14328,6 +14317,11 @@
           <w:lang w:val="de-DE"/>
         </w:rPr>
         <w:t>Dokumentstatus: Arbeitsgrundlage für Produktentscheidungen und inkrementelle Entwicklung. Änderungen sollten mit Versionsstand, Datum und kurzer Begründung ergänzt werden.</w:t>
+      </w:r>
+    </w:p>
+    <w:p>
+      <w:r>
+        <w:t>Änderungsstand 11.08.2026: Der verifizierte M5-Prototyp und der lokal erfolgreiche M6-Nachweis für DMG, Ersteinrichtung, Update, Rollback, Backup, Restore und Deinstallation wurden ergänzt. Die öffentliche Produktfreigabe und ihre externen Release-Gates bleiben ausdrücklich aufgeschoben.</w:t>
       </w:r>
     </w:p>
     <w:p>
@@ -14403,7 +14397,7 @@
         <w:color w:val="667085"/>
         <w:sz w:val="18"/>
       </w:rPr>
-      <w:t>0.1  |</w:t>
+      <w:t>0.2  |</w:t>
     </w:r>
     <w:proofErr w:type="gramEnd"/>
     <w:r>

</xml_diff>

<commit_message>
chore(release): synchronize main with develop (#56)
Synchronisiert den geprüften develop-Stand einschließlich der installierbaren Mac-App nach main.
</commit_message>
<xml_diff>
--- a/LifeOS Leitfaden.docx
+++ b/LifeOS Leitfaden.docx
@@ -60,12 +60,7 @@
         </w:rPr>
       </w:pPr>
       <w:r>
-        <w:rPr>
-          <w:b/>
-          <w:color w:val="0B2545"/>
-          <w:lang w:val="de-DE"/>
-        </w:rPr>
-        <w:t>Version 0.1 (Entwurf)</w:t>
+        <w:t>Version 0.2 (Entwurf)</w:t>
       </w:r>
     </w:p>
     <w:p>
@@ -77,12 +72,7 @@
         </w:rPr>
       </w:pPr>
       <w:r>
-        <w:rPr>
-          <w:color w:val="667085"/>
-          <w:sz w:val="21"/>
-          <w:lang w:val="de-DE"/>
-        </w:rPr>
-        <w:t>Stand: 18.07.2026</w:t>
+        <w:t>Stand: 09.08.2026</w:t>
       </w:r>
     </w:p>
     <w:p>
@@ -174,23 +164,17 @@
         </w:rPr>
       </w:pPr>
       <w:r>
-        <w:rPr>
-          <w:lang w:val="de-DE"/>
-        </w:rPr>
-        <w:t xml:space="preserve">Version: 0.1 (Entwurf)  </w:t>
-      </w:r>
-    </w:p>
-    <w:p>
-      <w:pPr>
-        <w:rPr>
-          <w:lang w:val="de-DE"/>
-        </w:rPr>
-      </w:pPr>
-      <w:r>
-        <w:rPr>
-          <w:lang w:val="de-DE"/>
-        </w:rPr>
-        <w:t xml:space="preserve">Stand: 18.07.2026  </w:t>
+        <w:t>Version: 0.2 (Entwurf)</w:t>
+      </w:r>
+    </w:p>
+    <w:p>
+      <w:pPr>
+        <w:rPr>
+          <w:lang w:val="de-DE"/>
+        </w:rPr>
+      </w:pPr>
+      <w:r>
+        <w:t>Stand: 09.08.2026</w:t>
       </w:r>
     </w:p>
     <w:p>
@@ -13911,13 +13895,42 @@
         <w:spacing w:after="80"/>
         <w:ind w:hanging="271"/>
       </w:pPr>
+      <w:r>
+        <w:t>Datenbank: SQLite im lokalen Mac-App-Betrieb; PostgreSQL bleibt Entwicklungs- und ausdrücklicher Rückfallpfad, bis die öffentliche Release-Freigabe und eine echte persönliche Datenübernahme abgeschlossen sind.</w:t>
+      </w:r>
+    </w:p>
+    <w:p>
+      <w:pPr>
+        <w:numPr>
+          <w:ilvl w:val="0"/>
+          <w:numId w:val="47"/>
+        </w:numPr>
+        <w:spacing w:after="80"/>
+        <w:ind w:hanging="271"/>
+      </w:pPr>
+      <w:r>
+        <w:t>Lokaler Betrieb: Tauri 2 startet die bestehende React-Oberfläche und das Node-/Express-Backend als gebündelten Sidecar ohne Docker oder separat installiertes Node.js. Docker Compose bleibt für PostgreSQL-Entwicklung und Tests verfügbar.</w:t>
+      </w:r>
+    </w:p>
+    <w:p>
+      <w:pPr>
+        <w:numPr>
+          <w:ilvl w:val="0"/>
+          <w:numId w:val="47"/>
+        </w:numPr>
+        <w:spacing w:after="80"/>
+        <w:ind w:hanging="271"/>
+      </w:pPr>
+      <w:r>
+        <w:t xml:space="preserve">Tests: Unit-, Integrations- und </w:t>
+      </w:r>
       <w:proofErr w:type="spellStart"/>
       <w:r>
-        <w:t>Datenbank</w:t>
+        <w:t>ausgewählte</w:t>
       </w:r>
       <w:proofErr w:type="spellEnd"/>
       <w:r>
-        <w:t>: PostgreSQL.</w:t>
+        <w:t xml:space="preserve"> End-to-End-Tests.</w:t>
       </w:r>
     </w:p>
     <w:p>
@@ -13928,53 +13941,6 @@
         </w:numPr>
         <w:spacing w:after="80"/>
         <w:ind w:hanging="271"/>
-      </w:pPr>
-      <w:proofErr w:type="spellStart"/>
-      <w:r>
-        <w:t>Lokale</w:t>
-      </w:r>
-      <w:proofErr w:type="spellEnd"/>
-      <w:r>
-        <w:t xml:space="preserve"> </w:t>
-      </w:r>
-      <w:proofErr w:type="spellStart"/>
-      <w:r>
-        <w:t>Entwicklung</w:t>
-      </w:r>
-      <w:proofErr w:type="spellEnd"/>
-      <w:r>
-        <w:t>: Docker Compose.</w:t>
-      </w:r>
-    </w:p>
-    <w:p>
-      <w:pPr>
-        <w:numPr>
-          <w:ilvl w:val="0"/>
-          <w:numId w:val="47"/>
-        </w:numPr>
-        <w:spacing w:after="80"/>
-        <w:ind w:hanging="271"/>
-      </w:pPr>
-      <w:r>
-        <w:t xml:space="preserve">Tests: Unit-, Integrations- und </w:t>
-      </w:r>
-      <w:proofErr w:type="spellStart"/>
-      <w:r>
-        <w:t>ausgewählte</w:t>
-      </w:r>
-      <w:proofErr w:type="spellEnd"/>
-      <w:r>
-        <w:t xml:space="preserve"> End-to-End-Tests.</w:t>
-      </w:r>
-    </w:p>
-    <w:p>
-      <w:pPr>
-        <w:numPr>
-          <w:ilvl w:val="0"/>
-          <w:numId w:val="47"/>
-        </w:numPr>
-        <w:spacing w:after="80"/>
-        <w:ind w:hanging="271"/>
         <w:rPr>
           <w:lang w:val="de-DE"/>
         </w:rPr>
@@ -13984,6 +13950,29 @@
           <w:lang w:val="de-DE"/>
         </w:rPr>
         <w:t>Dokumente: lokaler Speicher im MVP, abstrakte Storage-Schnittstelle für später.</w:t>
+      </w:r>
+    </w:p>
+    <w:p>
+      <w:pPr>
+        <w:pStyle w:val="Heading2"/>
+      </w:pPr>
+      <w:r>
+        <w:t>Bestätigter Mac-App- und lokaler Installationsnachweis (M5/M6)</w:t>
+      </w:r>
+    </w:p>
+    <w:p>
+      <w:r>
+        <w:t>Die geprüfte ARM64-App bündelt die bestehende Weboberfläche, die API, SQLite-Migrationen und eine fest auf Version 22.23.2 gesetzte offizielle Node.js-Laufzeit. Weboberfläche, API und CalDAV verwenden denselben dynamischen Loopback-Port; Anwendungsdaten und Protokolle erhalten private Dateirechte.</w:t>
+      </w:r>
+    </w:p>
+    <w:p>
+      <w:r>
+        <w:t>Lokal nachgewiesen: Das geprüfte DMG enthält App und Programme-Link. Die daraus kopierte App startet ohne Docker und ohne separat installiertes Node.js, richtet Profil sowie getrennte App- und CalDAV-Zugänge ohne Terminal ein und beendet den Sidecar geordnet. Update, Rollback, Backup und Restore erhielten stabile Benutzer-, Kalender- und Ereignisidentitäten. Das anschließende Entfernen der isolierten App-Kopien ließ Nutzerdaten und Update-Backup unangetastet. Die Fachparität wurde mit jeweils 47 API-Tests auf SQLite und PostgreSQL sowie ergänzenden Datenbank-, Web-, Browser-, Desktop- und Repository-Prüfungen bestätigt. Die SHA-256-Prüfsumme des zuletzt geprüften lokalen DMG lautet 9648de7f17294e3619b66772c87c26703e336460c6c55a54237e50cc8207c913.</w:t>
+      </w:r>
+    </w:p>
+    <w:p>
+      <w:r>
+        <w:t>M6 ist lokal erfolgreich; die öffentliche Produktfreigabe ist aufgeschoben. Offen bleiben Developer-ID-Signatur, Apple-Notarisierung, Gegencheck auf einem zweiten sauberen unterstützten Mac, Intel- oder Universal-Build und physischer Apple-Kalender-Test über ein abgesichertes LAN.</w:t>
       </w:r>
     </w:p>
     <w:p>
@@ -14328,6 +14317,11 @@
           <w:lang w:val="de-DE"/>
         </w:rPr>
         <w:t>Dokumentstatus: Arbeitsgrundlage für Produktentscheidungen und inkrementelle Entwicklung. Änderungen sollten mit Versionsstand, Datum und kurzer Begründung ergänzt werden.</w:t>
+      </w:r>
+    </w:p>
+    <w:p>
+      <w:r>
+        <w:t>Änderungsstand 11.08.2026: Der verifizierte M5-Prototyp und der lokal erfolgreiche M6-Nachweis für DMG, Ersteinrichtung, Update, Rollback, Backup, Restore und Deinstallation wurden ergänzt. Die öffentliche Produktfreigabe und ihre externen Release-Gates bleiben ausdrücklich aufgeschoben.</w:t>
       </w:r>
     </w:p>
     <w:p>
@@ -14403,7 +14397,7 @@
         <w:color w:val="667085"/>
         <w:sz w:val="18"/>
       </w:rPr>
-      <w:t>0.1  |</w:t>
+      <w:t>0.2  |</w:t>
     </w:r>
     <w:proofErr w:type="gramEnd"/>
     <w:r>

</xml_diff>

<commit_message>
docs(security): record full project audit
</commit_message>
<xml_diff>
--- a/LifeOS Leitfaden.docx
+++ b/LifeOS Leitfaden.docx
@@ -60,7 +60,7 @@
         </w:rPr>
       </w:pPr>
       <w:r>
-        <w:t>Version 0.2 (Entwurf)</w:t>
+        <w:t>Version 0.6 (Arbeitsgrundlage)</w:t>
       </w:r>
     </w:p>
     <w:p>
@@ -72,7 +72,7 @@
         </w:rPr>
       </w:pPr>
       <w:r>
-        <w:t>Stand: 09.08.2026</w:t>
+        <w:t>Stand: 07.09.2026</w:t>
       </w:r>
     </w:p>
     <w:p>
@@ -164,17 +164,17 @@
         </w:rPr>
       </w:pPr>
       <w:r>
-        <w:t>Version: 0.2 (Entwurf)</w:t>
-      </w:r>
-    </w:p>
-    <w:p>
-      <w:pPr>
-        <w:rPr>
-          <w:lang w:val="de-DE"/>
-        </w:rPr>
-      </w:pPr>
-      <w:r>
-        <w:t>Stand: 09.08.2026</w:t>
+        <w:t>Version: 0.6 (Arbeitsgrundlage)</w:t>
+      </w:r>
+    </w:p>
+    <w:p>
+      <w:pPr>
+        <w:rPr>
+          <w:lang w:val="de-DE"/>
+        </w:rPr>
+      </w:pPr>
+      <w:r>
+        <w:t>Stand: 07.09.2026</w:t>
       </w:r>
     </w:p>
     <w:p>
@@ -420,23 +420,12 @@
       </w:pPr>
       <w:r>
         <w:rPr>
-          <w:lang w:val="de-DE"/>
-        </w:rPr>
-        <w:t>**</w:t>
-      </w:r>
-      <w:proofErr w:type="gramStart"/>
-      <w:r>
-        <w:rPr>
-          <w:lang w:val="de-DE"/>
-        </w:rPr>
-        <w:t>Modularität:*</w:t>
-      </w:r>
-      <w:proofErr w:type="gramEnd"/>
-      <w:r>
-        <w:rPr>
-          <w:lang w:val="de-DE"/>
-        </w:rPr>
-        <w:t>* Neue Bereiche können ergänzt werden, ohne das Gesamtsystem neu zu bauen.</w:t>
+          <w:b/>
+        </w:rPr>
+        <w:t>Modularität:</w:t>
+      </w:r>
+      <w:r>
+        <w:t xml:space="preserve"> Neue Bereiche können ergänzt werden, ohne das Gesamtsystem neu zu bauen.</w:t>
       </w:r>
     </w:p>
     <w:p>
@@ -453,23 +442,12 @@
       </w:pPr>
       <w:r>
         <w:rPr>
-          <w:lang w:val="de-DE"/>
-        </w:rPr>
-        <w:t>**</w:t>
-      </w:r>
-      <w:proofErr w:type="gramStart"/>
-      <w:r>
-        <w:rPr>
-          <w:lang w:val="de-DE"/>
-        </w:rPr>
-        <w:t>Nachvollziehbarkeit:*</w:t>
-      </w:r>
-      <w:proofErr w:type="gramEnd"/>
-      <w:r>
-        <w:rPr>
-          <w:lang w:val="de-DE"/>
-        </w:rPr>
-        <w:t>* Datenherkunft, Berechnungen und KI-Empfehlungen bleiben verständlich.</w:t>
+          <w:b/>
+        </w:rPr>
+        <w:t>Nachvollziehbarkeit:</w:t>
+      </w:r>
+      <w:r>
+        <w:t xml:space="preserve"> Datenherkunft, Berechnungen und KI-Empfehlungen bleiben verständlich.</w:t>
       </w:r>
     </w:p>
     <w:p>
@@ -486,23 +464,12 @@
       </w:pPr>
       <w:r>
         <w:rPr>
-          <w:lang w:val="de-DE"/>
-        </w:rPr>
-        <w:t xml:space="preserve">**Lokaler </w:t>
-      </w:r>
-      <w:proofErr w:type="gramStart"/>
-      <w:r>
-        <w:rPr>
-          <w:lang w:val="de-DE"/>
-        </w:rPr>
-        <w:t>Start:*</w:t>
-      </w:r>
-      <w:proofErr w:type="gramEnd"/>
-      <w:r>
-        <w:rPr>
-          <w:lang w:val="de-DE"/>
-        </w:rPr>
-        <w:t>* Die erste Version funktioniert lokal mit synthetischen Beispieldaten und ohne produktive externe Integrationen.</w:t>
+          <w:b/>
+        </w:rPr>
+        <w:t>Lokaler Start:</w:t>
+      </w:r>
+      <w:r>
+        <w:t xml:space="preserve"> Die erste Version funktioniert lokal mit synthetischen Beispieldaten und ohne produktive externe Integrationen.</w:t>
       </w:r>
     </w:p>
     <w:p>
@@ -519,23 +486,12 @@
       </w:pPr>
       <w:r>
         <w:rPr>
-          <w:lang w:val="de-DE"/>
-        </w:rPr>
-        <w:t xml:space="preserve">**Manuelle </w:t>
-      </w:r>
-      <w:proofErr w:type="gramStart"/>
-      <w:r>
-        <w:rPr>
-          <w:lang w:val="de-DE"/>
-        </w:rPr>
-        <w:t>Kontrolle:*</w:t>
-      </w:r>
-      <w:proofErr w:type="gramEnd"/>
-      <w:r>
-        <w:rPr>
-          <w:lang w:val="de-DE"/>
-        </w:rPr>
-        <w:t>* Automationen dürfen Vorschläge erzeugen, aber keine wichtigen Daten stillschweigend ändern.</w:t>
+          <w:b/>
+        </w:rPr>
+        <w:t>Manuelle Kontrolle:</w:t>
+      </w:r>
+      <w:r>
+        <w:t xml:space="preserve"> Automationen dürfen Vorschläge erzeugen, aber keine wichtigen Daten stillschweigend ändern.</w:t>
       </w:r>
     </w:p>
     <w:p>
@@ -552,23 +508,12 @@
       </w:pPr>
       <w:r>
         <w:rPr>
-          <w:lang w:val="de-DE"/>
-        </w:rPr>
-        <w:t>**</w:t>
-      </w:r>
-      <w:proofErr w:type="gramStart"/>
-      <w:r>
-        <w:rPr>
-          <w:lang w:val="de-DE"/>
-        </w:rPr>
-        <w:t>Datensparsamkeit:*</w:t>
-      </w:r>
-      <w:proofErr w:type="gramEnd"/>
-      <w:r>
-        <w:rPr>
-          <w:lang w:val="de-DE"/>
-        </w:rPr>
-        <w:t>* Es werden nur Daten gespeichert, die für eine konkrete Funktion benötigt werden.</w:t>
+          <w:b/>
+        </w:rPr>
+        <w:t>Datensparsamkeit:</w:t>
+      </w:r>
+      <w:r>
+        <w:t xml:space="preserve"> Es werden nur Daten gespeichert, die für eine konkrete Funktion benötigt werden.</w:t>
       </w:r>
     </w:p>
     <w:p>
@@ -585,23 +530,12 @@
       </w:pPr>
       <w:r>
         <w:rPr>
-          <w:lang w:val="de-DE"/>
-        </w:rPr>
-        <w:t xml:space="preserve">**Verlässliche </w:t>
-      </w:r>
-      <w:proofErr w:type="gramStart"/>
-      <w:r>
-        <w:rPr>
-          <w:lang w:val="de-DE"/>
-        </w:rPr>
-        <w:t>KI:*</w:t>
-      </w:r>
-      <w:proofErr w:type="gramEnd"/>
-      <w:r>
-        <w:rPr>
-          <w:lang w:val="de-DE"/>
-        </w:rPr>
-        <w:t>* Der Assistent darf keine Fakten, Termine, Arbeitszeiten oder Finanzwerte erfinden.</w:t>
+          <w:b/>
+        </w:rPr>
+        <w:t>Verlässliche KI:</w:t>
+      </w:r>
+      <w:r>
+        <w:t xml:space="preserve"> Der Assistent darf keine Fakten, Termine, Arbeitszeiten oder Finanzwerte erfinden.</w:t>
       </w:r>
     </w:p>
     <w:p>
@@ -10105,15 +10039,13 @@
         <w:ind w:hanging="271"/>
       </w:pPr>
       <w:r>
-        <w:t>**</w:t>
-      </w:r>
-      <w:proofErr w:type="gramStart"/>
-      <w:r>
-        <w:t>GitHub:*</w:t>
-      </w:r>
-      <w:proofErr w:type="gramEnd"/>
-      <w:r>
-        <w:t>* Repositories, Issues, Pull Requests, Commits und CI-Status.</w:t>
+        <w:rPr>
+          <w:b/>
+        </w:rPr>
+        <w:t>GitHub:</w:t>
+      </w:r>
+      <w:r>
+        <w:t xml:space="preserve"> Repositories, Issues, Pull Requests, Commits und CI-Status.</w:t>
       </w:r>
     </w:p>
     <w:p>
@@ -10130,23 +10062,12 @@
       </w:pPr>
       <w:r>
         <w:rPr>
-          <w:lang w:val="de-DE"/>
-        </w:rPr>
-        <w:t>**</w:t>
-      </w:r>
-      <w:proofErr w:type="gramStart"/>
-      <w:r>
-        <w:rPr>
-          <w:lang w:val="de-DE"/>
-        </w:rPr>
-        <w:t>Kalender:*</w:t>
-      </w:r>
-      <w:proofErr w:type="gramEnd"/>
-      <w:r>
-        <w:rPr>
-          <w:lang w:val="de-DE"/>
-        </w:rPr>
-        <w:t>* Import oder Export von Terminen und Zeitblöcken, zunächst optional über ICS.</w:t>
+          <w:b/>
+        </w:rPr>
+        <w:t>Kalender:</w:t>
+      </w:r>
+      <w:r>
+        <w:t xml:space="preserve"> Import oder Export von Terminen und Zeitblöcken, zunächst optional über ICS.</w:t>
       </w:r>
     </w:p>
     <w:p>
@@ -10163,23 +10084,12 @@
       </w:pPr>
       <w:r>
         <w:rPr>
-          <w:lang w:val="de-DE"/>
-        </w:rPr>
-        <w:t>**</w:t>
-      </w:r>
-      <w:proofErr w:type="gramStart"/>
-      <w:r>
-        <w:rPr>
-          <w:lang w:val="de-DE"/>
-        </w:rPr>
-        <w:t>Dokumentablage:*</w:t>
-      </w:r>
-      <w:proofErr w:type="gramEnd"/>
-      <w:r>
-        <w:rPr>
-          <w:lang w:val="de-DE"/>
-        </w:rPr>
-        <w:t>* Lokale Dateien und Uploads für Studium und Wissen.</w:t>
+          <w:b/>
+        </w:rPr>
+        <w:t>Dokumentablage:</w:t>
+      </w:r>
+      <w:r>
+        <w:t xml:space="preserve"> Lokale Dateien und Uploads für Studium und Wissen.</w:t>
       </w:r>
     </w:p>
     <w:p>
@@ -10196,23 +10106,12 @@
       </w:pPr>
       <w:r>
         <w:rPr>
-          <w:lang w:val="de-DE"/>
-        </w:rPr>
-        <w:t>**KI-</w:t>
-      </w:r>
-      <w:proofErr w:type="gramStart"/>
-      <w:r>
-        <w:rPr>
-          <w:lang w:val="de-DE"/>
-        </w:rPr>
-        <w:t>Anbieter:*</w:t>
-      </w:r>
-      <w:proofErr w:type="gramEnd"/>
-      <w:r>
-        <w:rPr>
-          <w:lang w:val="de-DE"/>
-        </w:rPr>
-        <w:t>* Verarbeitung nur nach aktivierter Datenfreigabe.</w:t>
+          <w:b/>
+        </w:rPr>
+        <w:t>KI-Anbieter:</w:t>
+      </w:r>
+      <w:r>
+        <w:t xml:space="preserve"> Verarbeitung nur nach aktivierter Datenfreigabe.</w:t>
       </w:r>
     </w:p>
     <w:p>
@@ -10229,23 +10128,12 @@
       </w:pPr>
       <w:r>
         <w:rPr>
-          <w:lang w:val="de-DE"/>
-        </w:rPr>
-        <w:t>**</w:t>
-      </w:r>
-      <w:proofErr w:type="gramStart"/>
-      <w:r>
-        <w:rPr>
-          <w:lang w:val="de-DE"/>
-        </w:rPr>
-        <w:t>Finanzen:*</w:t>
-      </w:r>
-      <w:proofErr w:type="gramEnd"/>
-      <w:r>
-        <w:rPr>
-          <w:lang w:val="de-DE"/>
-        </w:rPr>
-        <w:t>* Im MVP manuelle Eingabe oder CSV-Import; kein automatischer Bankzugriff.</w:t>
+          <w:b/>
+        </w:rPr>
+        <w:t>Finanzen:</w:t>
+      </w:r>
+      <w:r>
+        <w:t xml:space="preserve"> Im MVP manuelle Eingabe oder CSV-Import; kein automatischer Bankzugriff.</w:t>
       </w:r>
     </w:p>
     <w:p>
@@ -10262,23 +10150,12 @@
       </w:pPr>
       <w:r>
         <w:rPr>
-          <w:lang w:val="de-DE"/>
-        </w:rPr>
-        <w:t>**</w:t>
-      </w:r>
-      <w:proofErr w:type="gramStart"/>
-      <w:r>
-        <w:rPr>
-          <w:lang w:val="de-DE"/>
-        </w:rPr>
-        <w:t>Fitnessdaten:*</w:t>
-      </w:r>
-      <w:proofErr w:type="gramEnd"/>
-      <w:r>
-        <w:rPr>
-          <w:lang w:val="de-DE"/>
-        </w:rPr>
-        <w:t>* Zunächst manuelle Eingabe; Geräteschnittstellen erst nach klarer Datenschutzentscheidung.</w:t>
+          <w:b/>
+        </w:rPr>
+        <w:t>Fitnessdaten:</w:t>
+      </w:r>
+      <w:r>
+        <w:t xml:space="preserve"> Zunächst manuelle Eingabe; Geräteschnittstellen erst nach klarer Datenschutzentscheidung.</w:t>
       </w:r>
     </w:p>
     <w:p>
@@ -13962,12 +13839,12 @@
     </w:p>
     <w:p>
       <w:r>
-        <w:t>Die geprüfte ARM64-App bündelt die bestehende Weboberfläche, die API, SQLite-Migrationen und eine fest auf Version 22.23.2 gesetzte offizielle Node.js-Laufzeit. Weboberfläche, API und CalDAV verwenden denselben dynamischen Loopback-Port; Anwendungsdaten und Protokolle erhalten private Dateirechte.</w:t>
-      </w:r>
-    </w:p>
-    <w:p>
-      <w:r>
-        <w:t>Lokal nachgewiesen: Das geprüfte DMG enthält App und Programme-Link. Die daraus kopierte App startet ohne Docker und ohne separat installiertes Node.js, richtet Profil sowie getrennte App- und CalDAV-Zugänge ohne Terminal ein und beendet den Sidecar geordnet. Update, Rollback, Backup und Restore erhielten stabile Benutzer-, Kalender- und Ereignisidentitäten. Das anschließende Entfernen der isolierten App-Kopien ließ Nutzerdaten und Update-Backup unangetastet. Die Fachparität wurde mit jeweils 47 API-Tests auf SQLite und PostgreSQL sowie ergänzenden Datenbank-, Web-, Browser-, Desktop- und Repository-Prüfungen bestätigt. Die SHA-256-Prüfsumme des zuletzt geprüften lokalen DMG lautet 9648de7f17294e3619b66772c87c26703e336460c6c55a54237e50cc8207c913.</w:t>
+        <w:t>Die geprüfte ARM64-App bündelt die bestehende Weboberfläche, die API, SQLite-Migrationen und eine fest auf Version 22.23.2 gesetzte offizielle Node.js-Laufzeit. Weboberfläche, API und CalDAV verwenden denselben dynamischen Loopback-Port; Anwendungsdaten und Protokolle erhalten private Dateirechte. Eine Einzelinstanzsperre schützt den SQLite-Schreiber. Der Sidecar erhält nur freigegebene Umgebungswerte und bestätigt jeden Start mit einem neuen zufälligen Readiness-Nachweis.</w:t>
+      </w:r>
+    </w:p>
+    <w:p>
+      <w:r>
+        <w:t>Lokal nachgewiesen: Das geprüfte DMG enthält App und Programme-Link. Die daraus kopierte App startet ohne Docker und ohne separat installiertes Node.js, richtet Profil sowie getrennte App- und CalDAV-Zugänge ohne Terminal ein und beendet den Sidecar geordnet. Update, Rollback, Backup und Restore erhielten stabile Benutzer-, Kalender- und Ereignisidentitäten. Das anschließende Entfernen der isolierten App-Kopien ließ Nutzerdaten und Update-Backup unangetastet. Die Fachparität wurde zuletzt mit jeweils 88 API-Tests auf SQLite und PostgreSQL sowie ergänzenden Datenbank-, Web-, Browser-, Sidecar-, Rust- und Repository-Prüfungen bestätigt. Jedes neu gebaute DMG erhält eine eigene portable SHA-256-Datei; eine ältere feste Artefaktprüfsumme ist kein aktueller Freigabenachweis.</w:t>
       </w:r>
     </w:p>
     <w:p>
@@ -14034,10 +13911,7 @@
         </w:rPr>
       </w:pPr>
       <w:r>
-        <w:rPr>
-          <w:lang w:val="de-DE"/>
-        </w:rPr>
-        <w:t>Welche Kalenderquelle soll zuerst unterstützt werden: ICS, Google Calendar oder eine andere?</w:t>
+        <w:t>Welche weitere Kalenderquelle soll nach ICS und dem kontrollierten CalDAV-Import unterstützt werden?</w:t>
       </w:r>
     </w:p>
     <w:p>
@@ -14321,7 +14195,7 @@
     </w:p>
     <w:p>
       <w:r>
-        <w:t>Änderungsstand 11.08.2026: Der verifizierte M5-Prototyp und der lokal erfolgreiche M6-Nachweis für DMG, Ersteinrichtung, Update, Rollback, Backup, Restore und Deinstallation wurden ergänzt. Die öffentliche Produktfreigabe und ihre externen Release-Gates bleiben ausdrücklich aufgeschoben.</w:t>
+        <w:t>Änderungsstand 07.09.2026: Der lokal erfolgreiche M6-Nachweis und der vollständige Sicherheits-, Integritäts- und Stabilitätsreview wurden ergänzt. Dazu gehören stärkere Passwortableitung, Sitzungs- und Login-Härtung, externe Netzwerk- und Backup-Grenzen, Dokumentintegrität, Browser-CSP, Sidecar-Isolation und Einzelinstanzschutz. Die öffentliche Produktfreigabe und ihre externen Apple- und Geräte-Gates bleiben ausdrücklich aufgeschoben.</w:t>
       </w:r>
     </w:p>
     <w:p>
@@ -14342,6 +14216,8 @@
     <w:sectPr>
       <w:headerReference w:type="default" r:id="rId8"/>
       <w:footerReference w:type="default" r:id="rId9"/>
+      <w:footerReference w:type="first" r:id="rId12"/>
+      <w:footerReference w:type="even" r:id="rId13"/>
       <w:pgSz w:w="12240" w:h="15840"/>
       <w:pgMar w:top="1440" w:right="1440" w:bottom="1440" w:left="1440" w:header="708" w:footer="708" w:gutter="0"/>
       <w:cols w:space="720"/>
@@ -14397,7 +14273,7 @@
         <w:color w:val="667085"/>
         <w:sz w:val="18"/>
       </w:rPr>
-      <w:t>0.2  |</w:t>
+      <w:t>0.6  |</w:t>
     </w:r>
     <w:proofErr w:type="gramEnd"/>
     <w:r>
@@ -14459,6 +14335,26 @@
       </w:rPr>
       <w:fldChar w:fldCharType="end"/>
     </w:r>
+  </w:p>
+</w:ftr>
+</file>
+
+<file path=word/footer2.xml><?xml version="1.0" encoding="utf-8"?>
+<w:ftr xmlns:m="http://schemas.openxmlformats.org/officeDocument/2006/math" xmlns:mc="http://schemas.openxmlformats.org/markup-compatibility/2006" xmlns:mo="http://schemas.microsoft.com/office/mac/office/2008/main" xmlns:mv="urn:schemas-microsoft-com:mac:vml" xmlns:o="urn:schemas-microsoft-com:office:office" xmlns:r="http://schemas.openxmlformats.org/officeDocument/2006/relationships" xmlns:v="urn:schemas-microsoft-com:vml" xmlns:w10="urn:schemas-microsoft-com:office:word" xmlns:w14="http://schemas.microsoft.com/office/word/2010/wordml" xmlns:w="http://schemas.openxmlformats.org/wordprocessingml/2006/main" xmlns:wne="http://schemas.microsoft.com/office/word/2006/wordml" xmlns:wp14="http://schemas.microsoft.com/office/word/2010/wordprocessingDrawing" xmlns:wp="http://schemas.openxmlformats.org/drawingml/2006/wordprocessingDrawing" xmlns:wpc="http://schemas.microsoft.com/office/word/2010/wordprocessingCanvas" xmlns:wpg="http://schemas.microsoft.com/office/word/2010/wordprocessingGroup" xmlns:wpi="http://schemas.microsoft.com/office/word/2010/wordprocessingInk" xmlns:wps="http://schemas.microsoft.com/office/word/2010/wordprocessingShape" mc:Ignorable="w14 wp14">
+  <w:p>
+    <w:pPr>
+      <w:pStyle w:val="Footer"/>
+    </w:pPr>
+  </w:p>
+</w:ftr>
+</file>
+
+<file path=word/footer3.xml><?xml version="1.0" encoding="utf-8"?>
+<w:ftr xmlns:m="http://schemas.openxmlformats.org/officeDocument/2006/math" xmlns:mc="http://schemas.openxmlformats.org/markup-compatibility/2006" xmlns:mo="http://schemas.microsoft.com/office/mac/office/2008/main" xmlns:mv="urn:schemas-microsoft-com:mac:vml" xmlns:o="urn:schemas-microsoft-com:office:office" xmlns:r="http://schemas.openxmlformats.org/officeDocument/2006/relationships" xmlns:v="urn:schemas-microsoft-com:vml" xmlns:w10="urn:schemas-microsoft-com:office:word" xmlns:w14="http://schemas.microsoft.com/office/word/2010/wordml" xmlns:w="http://schemas.openxmlformats.org/wordprocessingml/2006/main" xmlns:wne="http://schemas.microsoft.com/office/word/2006/wordml" xmlns:wp14="http://schemas.microsoft.com/office/word/2010/wordprocessingDrawing" xmlns:wp="http://schemas.openxmlformats.org/drawingml/2006/wordprocessingDrawing" xmlns:wpc="http://schemas.microsoft.com/office/word/2010/wordprocessingCanvas" xmlns:wpg="http://schemas.microsoft.com/office/word/2010/wordprocessingGroup" xmlns:wpi="http://schemas.microsoft.com/office/word/2010/wordprocessingInk" xmlns:wps="http://schemas.microsoft.com/office/word/2010/wordprocessingShape" mc:Ignorable="w14 wp14">
+  <w:p>
+    <w:pPr>
+      <w:pStyle w:val="Footer"/>
+    </w:pPr>
   </w:p>
 </w:ftr>
 </file>

</xml_diff>

<commit_message>
chore(security): audit integrity and stability (#82)
* fix(deps): resolve audited dependency vulnerabilities

* fix(security): harden authentication and API boundaries

* fix(recovery): enforce document and backup integrity

* fix(desktop): isolate sidecar and enforce single writer

* ci(security): gate npm and Rust dependency audits

* docs(security): record full project audit
</commit_message>
<xml_diff>
--- a/LifeOS Leitfaden.docx
+++ b/LifeOS Leitfaden.docx
@@ -60,7 +60,7 @@
         </w:rPr>
       </w:pPr>
       <w:r>
-        <w:t>Version 0.2 (Entwurf)</w:t>
+        <w:t>Version 0.6 (Arbeitsgrundlage)</w:t>
       </w:r>
     </w:p>
     <w:p>
@@ -72,7 +72,7 @@
         </w:rPr>
       </w:pPr>
       <w:r>
-        <w:t>Stand: 09.08.2026</w:t>
+        <w:t>Stand: 07.09.2026</w:t>
       </w:r>
     </w:p>
     <w:p>
@@ -164,17 +164,17 @@
         </w:rPr>
       </w:pPr>
       <w:r>
-        <w:t>Version: 0.2 (Entwurf)</w:t>
-      </w:r>
-    </w:p>
-    <w:p>
-      <w:pPr>
-        <w:rPr>
-          <w:lang w:val="de-DE"/>
-        </w:rPr>
-      </w:pPr>
-      <w:r>
-        <w:t>Stand: 09.08.2026</w:t>
+        <w:t>Version: 0.6 (Arbeitsgrundlage)</w:t>
+      </w:r>
+    </w:p>
+    <w:p>
+      <w:pPr>
+        <w:rPr>
+          <w:lang w:val="de-DE"/>
+        </w:rPr>
+      </w:pPr>
+      <w:r>
+        <w:t>Stand: 07.09.2026</w:t>
       </w:r>
     </w:p>
     <w:p>
@@ -420,23 +420,12 @@
       </w:pPr>
       <w:r>
         <w:rPr>
-          <w:lang w:val="de-DE"/>
-        </w:rPr>
-        <w:t>**</w:t>
-      </w:r>
-      <w:proofErr w:type="gramStart"/>
-      <w:r>
-        <w:rPr>
-          <w:lang w:val="de-DE"/>
-        </w:rPr>
-        <w:t>Modularität:*</w:t>
-      </w:r>
-      <w:proofErr w:type="gramEnd"/>
-      <w:r>
-        <w:rPr>
-          <w:lang w:val="de-DE"/>
-        </w:rPr>
-        <w:t>* Neue Bereiche können ergänzt werden, ohne das Gesamtsystem neu zu bauen.</w:t>
+          <w:b/>
+        </w:rPr>
+        <w:t>Modularität:</w:t>
+      </w:r>
+      <w:r>
+        <w:t xml:space="preserve"> Neue Bereiche können ergänzt werden, ohne das Gesamtsystem neu zu bauen.</w:t>
       </w:r>
     </w:p>
     <w:p>
@@ -453,23 +442,12 @@
       </w:pPr>
       <w:r>
         <w:rPr>
-          <w:lang w:val="de-DE"/>
-        </w:rPr>
-        <w:t>**</w:t>
-      </w:r>
-      <w:proofErr w:type="gramStart"/>
-      <w:r>
-        <w:rPr>
-          <w:lang w:val="de-DE"/>
-        </w:rPr>
-        <w:t>Nachvollziehbarkeit:*</w:t>
-      </w:r>
-      <w:proofErr w:type="gramEnd"/>
-      <w:r>
-        <w:rPr>
-          <w:lang w:val="de-DE"/>
-        </w:rPr>
-        <w:t>* Datenherkunft, Berechnungen und KI-Empfehlungen bleiben verständlich.</w:t>
+          <w:b/>
+        </w:rPr>
+        <w:t>Nachvollziehbarkeit:</w:t>
+      </w:r>
+      <w:r>
+        <w:t xml:space="preserve"> Datenherkunft, Berechnungen und KI-Empfehlungen bleiben verständlich.</w:t>
       </w:r>
     </w:p>
     <w:p>
@@ -486,23 +464,12 @@
       </w:pPr>
       <w:r>
         <w:rPr>
-          <w:lang w:val="de-DE"/>
-        </w:rPr>
-        <w:t xml:space="preserve">**Lokaler </w:t>
-      </w:r>
-      <w:proofErr w:type="gramStart"/>
-      <w:r>
-        <w:rPr>
-          <w:lang w:val="de-DE"/>
-        </w:rPr>
-        <w:t>Start:*</w:t>
-      </w:r>
-      <w:proofErr w:type="gramEnd"/>
-      <w:r>
-        <w:rPr>
-          <w:lang w:val="de-DE"/>
-        </w:rPr>
-        <w:t>* Die erste Version funktioniert lokal mit synthetischen Beispieldaten und ohne produktive externe Integrationen.</w:t>
+          <w:b/>
+        </w:rPr>
+        <w:t>Lokaler Start:</w:t>
+      </w:r>
+      <w:r>
+        <w:t xml:space="preserve"> Die erste Version funktioniert lokal mit synthetischen Beispieldaten und ohne produktive externe Integrationen.</w:t>
       </w:r>
     </w:p>
     <w:p>
@@ -519,23 +486,12 @@
       </w:pPr>
       <w:r>
         <w:rPr>
-          <w:lang w:val="de-DE"/>
-        </w:rPr>
-        <w:t xml:space="preserve">**Manuelle </w:t>
-      </w:r>
-      <w:proofErr w:type="gramStart"/>
-      <w:r>
-        <w:rPr>
-          <w:lang w:val="de-DE"/>
-        </w:rPr>
-        <w:t>Kontrolle:*</w:t>
-      </w:r>
-      <w:proofErr w:type="gramEnd"/>
-      <w:r>
-        <w:rPr>
-          <w:lang w:val="de-DE"/>
-        </w:rPr>
-        <w:t>* Automationen dürfen Vorschläge erzeugen, aber keine wichtigen Daten stillschweigend ändern.</w:t>
+          <w:b/>
+        </w:rPr>
+        <w:t>Manuelle Kontrolle:</w:t>
+      </w:r>
+      <w:r>
+        <w:t xml:space="preserve"> Automationen dürfen Vorschläge erzeugen, aber keine wichtigen Daten stillschweigend ändern.</w:t>
       </w:r>
     </w:p>
     <w:p>
@@ -552,23 +508,12 @@
       </w:pPr>
       <w:r>
         <w:rPr>
-          <w:lang w:val="de-DE"/>
-        </w:rPr>
-        <w:t>**</w:t>
-      </w:r>
-      <w:proofErr w:type="gramStart"/>
-      <w:r>
-        <w:rPr>
-          <w:lang w:val="de-DE"/>
-        </w:rPr>
-        <w:t>Datensparsamkeit:*</w:t>
-      </w:r>
-      <w:proofErr w:type="gramEnd"/>
-      <w:r>
-        <w:rPr>
-          <w:lang w:val="de-DE"/>
-        </w:rPr>
-        <w:t>* Es werden nur Daten gespeichert, die für eine konkrete Funktion benötigt werden.</w:t>
+          <w:b/>
+        </w:rPr>
+        <w:t>Datensparsamkeit:</w:t>
+      </w:r>
+      <w:r>
+        <w:t xml:space="preserve"> Es werden nur Daten gespeichert, die für eine konkrete Funktion benötigt werden.</w:t>
       </w:r>
     </w:p>
     <w:p>
@@ -585,23 +530,12 @@
       </w:pPr>
       <w:r>
         <w:rPr>
-          <w:lang w:val="de-DE"/>
-        </w:rPr>
-        <w:t xml:space="preserve">**Verlässliche </w:t>
-      </w:r>
-      <w:proofErr w:type="gramStart"/>
-      <w:r>
-        <w:rPr>
-          <w:lang w:val="de-DE"/>
-        </w:rPr>
-        <w:t>KI:*</w:t>
-      </w:r>
-      <w:proofErr w:type="gramEnd"/>
-      <w:r>
-        <w:rPr>
-          <w:lang w:val="de-DE"/>
-        </w:rPr>
-        <w:t>* Der Assistent darf keine Fakten, Termine, Arbeitszeiten oder Finanzwerte erfinden.</w:t>
+          <w:b/>
+        </w:rPr>
+        <w:t>Verlässliche KI:</w:t>
+      </w:r>
+      <w:r>
+        <w:t xml:space="preserve"> Der Assistent darf keine Fakten, Termine, Arbeitszeiten oder Finanzwerte erfinden.</w:t>
       </w:r>
     </w:p>
     <w:p>
@@ -10105,15 +10039,13 @@
         <w:ind w:hanging="271"/>
       </w:pPr>
       <w:r>
-        <w:t>**</w:t>
-      </w:r>
-      <w:proofErr w:type="gramStart"/>
-      <w:r>
-        <w:t>GitHub:*</w:t>
-      </w:r>
-      <w:proofErr w:type="gramEnd"/>
-      <w:r>
-        <w:t>* Repositories, Issues, Pull Requests, Commits und CI-Status.</w:t>
+        <w:rPr>
+          <w:b/>
+        </w:rPr>
+        <w:t>GitHub:</w:t>
+      </w:r>
+      <w:r>
+        <w:t xml:space="preserve"> Repositories, Issues, Pull Requests, Commits und CI-Status.</w:t>
       </w:r>
     </w:p>
     <w:p>
@@ -10130,23 +10062,12 @@
       </w:pPr>
       <w:r>
         <w:rPr>
-          <w:lang w:val="de-DE"/>
-        </w:rPr>
-        <w:t>**</w:t>
-      </w:r>
-      <w:proofErr w:type="gramStart"/>
-      <w:r>
-        <w:rPr>
-          <w:lang w:val="de-DE"/>
-        </w:rPr>
-        <w:t>Kalender:*</w:t>
-      </w:r>
-      <w:proofErr w:type="gramEnd"/>
-      <w:r>
-        <w:rPr>
-          <w:lang w:val="de-DE"/>
-        </w:rPr>
-        <w:t>* Import oder Export von Terminen und Zeitblöcken, zunächst optional über ICS.</w:t>
+          <w:b/>
+        </w:rPr>
+        <w:t>Kalender:</w:t>
+      </w:r>
+      <w:r>
+        <w:t xml:space="preserve"> Import oder Export von Terminen und Zeitblöcken, zunächst optional über ICS.</w:t>
       </w:r>
     </w:p>
     <w:p>
@@ -10163,23 +10084,12 @@
       </w:pPr>
       <w:r>
         <w:rPr>
-          <w:lang w:val="de-DE"/>
-        </w:rPr>
-        <w:t>**</w:t>
-      </w:r>
-      <w:proofErr w:type="gramStart"/>
-      <w:r>
-        <w:rPr>
-          <w:lang w:val="de-DE"/>
-        </w:rPr>
-        <w:t>Dokumentablage:*</w:t>
-      </w:r>
-      <w:proofErr w:type="gramEnd"/>
-      <w:r>
-        <w:rPr>
-          <w:lang w:val="de-DE"/>
-        </w:rPr>
-        <w:t>* Lokale Dateien und Uploads für Studium und Wissen.</w:t>
+          <w:b/>
+        </w:rPr>
+        <w:t>Dokumentablage:</w:t>
+      </w:r>
+      <w:r>
+        <w:t xml:space="preserve"> Lokale Dateien und Uploads für Studium und Wissen.</w:t>
       </w:r>
     </w:p>
     <w:p>
@@ -10196,23 +10106,12 @@
       </w:pPr>
       <w:r>
         <w:rPr>
-          <w:lang w:val="de-DE"/>
-        </w:rPr>
-        <w:t>**KI-</w:t>
-      </w:r>
-      <w:proofErr w:type="gramStart"/>
-      <w:r>
-        <w:rPr>
-          <w:lang w:val="de-DE"/>
-        </w:rPr>
-        <w:t>Anbieter:*</w:t>
-      </w:r>
-      <w:proofErr w:type="gramEnd"/>
-      <w:r>
-        <w:rPr>
-          <w:lang w:val="de-DE"/>
-        </w:rPr>
-        <w:t>* Verarbeitung nur nach aktivierter Datenfreigabe.</w:t>
+          <w:b/>
+        </w:rPr>
+        <w:t>KI-Anbieter:</w:t>
+      </w:r>
+      <w:r>
+        <w:t xml:space="preserve"> Verarbeitung nur nach aktivierter Datenfreigabe.</w:t>
       </w:r>
     </w:p>
     <w:p>
@@ -10229,23 +10128,12 @@
       </w:pPr>
       <w:r>
         <w:rPr>
-          <w:lang w:val="de-DE"/>
-        </w:rPr>
-        <w:t>**</w:t>
-      </w:r>
-      <w:proofErr w:type="gramStart"/>
-      <w:r>
-        <w:rPr>
-          <w:lang w:val="de-DE"/>
-        </w:rPr>
-        <w:t>Finanzen:*</w:t>
-      </w:r>
-      <w:proofErr w:type="gramEnd"/>
-      <w:r>
-        <w:rPr>
-          <w:lang w:val="de-DE"/>
-        </w:rPr>
-        <w:t>* Im MVP manuelle Eingabe oder CSV-Import; kein automatischer Bankzugriff.</w:t>
+          <w:b/>
+        </w:rPr>
+        <w:t>Finanzen:</w:t>
+      </w:r>
+      <w:r>
+        <w:t xml:space="preserve"> Im MVP manuelle Eingabe oder CSV-Import; kein automatischer Bankzugriff.</w:t>
       </w:r>
     </w:p>
     <w:p>
@@ -10262,23 +10150,12 @@
       </w:pPr>
       <w:r>
         <w:rPr>
-          <w:lang w:val="de-DE"/>
-        </w:rPr>
-        <w:t>**</w:t>
-      </w:r>
-      <w:proofErr w:type="gramStart"/>
-      <w:r>
-        <w:rPr>
-          <w:lang w:val="de-DE"/>
-        </w:rPr>
-        <w:t>Fitnessdaten:*</w:t>
-      </w:r>
-      <w:proofErr w:type="gramEnd"/>
-      <w:r>
-        <w:rPr>
-          <w:lang w:val="de-DE"/>
-        </w:rPr>
-        <w:t>* Zunächst manuelle Eingabe; Geräteschnittstellen erst nach klarer Datenschutzentscheidung.</w:t>
+          <w:b/>
+        </w:rPr>
+        <w:t>Fitnessdaten:</w:t>
+      </w:r>
+      <w:r>
+        <w:t xml:space="preserve"> Zunächst manuelle Eingabe; Geräteschnittstellen erst nach klarer Datenschutzentscheidung.</w:t>
       </w:r>
     </w:p>
     <w:p>
@@ -13962,12 +13839,12 @@
     </w:p>
     <w:p>
       <w:r>
-        <w:t>Die geprüfte ARM64-App bündelt die bestehende Weboberfläche, die API, SQLite-Migrationen und eine fest auf Version 22.23.2 gesetzte offizielle Node.js-Laufzeit. Weboberfläche, API und CalDAV verwenden denselben dynamischen Loopback-Port; Anwendungsdaten und Protokolle erhalten private Dateirechte.</w:t>
-      </w:r>
-    </w:p>
-    <w:p>
-      <w:r>
-        <w:t>Lokal nachgewiesen: Das geprüfte DMG enthält App und Programme-Link. Die daraus kopierte App startet ohne Docker und ohne separat installiertes Node.js, richtet Profil sowie getrennte App- und CalDAV-Zugänge ohne Terminal ein und beendet den Sidecar geordnet. Update, Rollback, Backup und Restore erhielten stabile Benutzer-, Kalender- und Ereignisidentitäten. Das anschließende Entfernen der isolierten App-Kopien ließ Nutzerdaten und Update-Backup unangetastet. Die Fachparität wurde mit jeweils 47 API-Tests auf SQLite und PostgreSQL sowie ergänzenden Datenbank-, Web-, Browser-, Desktop- und Repository-Prüfungen bestätigt. Die SHA-256-Prüfsumme des zuletzt geprüften lokalen DMG lautet 9648de7f17294e3619b66772c87c26703e336460c6c55a54237e50cc8207c913.</w:t>
+        <w:t>Die geprüfte ARM64-App bündelt die bestehende Weboberfläche, die API, SQLite-Migrationen und eine fest auf Version 22.23.2 gesetzte offizielle Node.js-Laufzeit. Weboberfläche, API und CalDAV verwenden denselben dynamischen Loopback-Port; Anwendungsdaten und Protokolle erhalten private Dateirechte. Eine Einzelinstanzsperre schützt den SQLite-Schreiber. Der Sidecar erhält nur freigegebene Umgebungswerte und bestätigt jeden Start mit einem neuen zufälligen Readiness-Nachweis.</w:t>
+      </w:r>
+    </w:p>
+    <w:p>
+      <w:r>
+        <w:t>Lokal nachgewiesen: Das geprüfte DMG enthält App und Programme-Link. Die daraus kopierte App startet ohne Docker und ohne separat installiertes Node.js, richtet Profil sowie getrennte App- und CalDAV-Zugänge ohne Terminal ein und beendet den Sidecar geordnet. Update, Rollback, Backup und Restore erhielten stabile Benutzer-, Kalender- und Ereignisidentitäten. Das anschließende Entfernen der isolierten App-Kopien ließ Nutzerdaten und Update-Backup unangetastet. Die Fachparität wurde zuletzt mit jeweils 88 API-Tests auf SQLite und PostgreSQL sowie ergänzenden Datenbank-, Web-, Browser-, Sidecar-, Rust- und Repository-Prüfungen bestätigt. Jedes neu gebaute DMG erhält eine eigene portable SHA-256-Datei; eine ältere feste Artefaktprüfsumme ist kein aktueller Freigabenachweis.</w:t>
       </w:r>
     </w:p>
     <w:p>
@@ -14034,10 +13911,7 @@
         </w:rPr>
       </w:pPr>
       <w:r>
-        <w:rPr>
-          <w:lang w:val="de-DE"/>
-        </w:rPr>
-        <w:t>Welche Kalenderquelle soll zuerst unterstützt werden: ICS, Google Calendar oder eine andere?</w:t>
+        <w:t>Welche weitere Kalenderquelle soll nach ICS und dem kontrollierten CalDAV-Import unterstützt werden?</w:t>
       </w:r>
     </w:p>
     <w:p>
@@ -14321,7 +14195,7 @@
     </w:p>
     <w:p>
       <w:r>
-        <w:t>Änderungsstand 11.08.2026: Der verifizierte M5-Prototyp und der lokal erfolgreiche M6-Nachweis für DMG, Ersteinrichtung, Update, Rollback, Backup, Restore und Deinstallation wurden ergänzt. Die öffentliche Produktfreigabe und ihre externen Release-Gates bleiben ausdrücklich aufgeschoben.</w:t>
+        <w:t>Änderungsstand 07.09.2026: Der lokal erfolgreiche M6-Nachweis und der vollständige Sicherheits-, Integritäts- und Stabilitätsreview wurden ergänzt. Dazu gehören stärkere Passwortableitung, Sitzungs- und Login-Härtung, externe Netzwerk- und Backup-Grenzen, Dokumentintegrität, Browser-CSP, Sidecar-Isolation und Einzelinstanzschutz. Die öffentliche Produktfreigabe und ihre externen Apple- und Geräte-Gates bleiben ausdrücklich aufgeschoben.</w:t>
       </w:r>
     </w:p>
     <w:p>
@@ -14342,6 +14216,8 @@
     <w:sectPr>
       <w:headerReference w:type="default" r:id="rId8"/>
       <w:footerReference w:type="default" r:id="rId9"/>
+      <w:footerReference w:type="first" r:id="rId12"/>
+      <w:footerReference w:type="even" r:id="rId13"/>
       <w:pgSz w:w="12240" w:h="15840"/>
       <w:pgMar w:top="1440" w:right="1440" w:bottom="1440" w:left="1440" w:header="708" w:footer="708" w:gutter="0"/>
       <w:cols w:space="720"/>
@@ -14397,7 +14273,7 @@
         <w:color w:val="667085"/>
         <w:sz w:val="18"/>
       </w:rPr>
-      <w:t>0.2  |</w:t>
+      <w:t>0.6  |</w:t>
     </w:r>
     <w:proofErr w:type="gramEnd"/>
     <w:r>
@@ -14459,6 +14335,26 @@
       </w:rPr>
       <w:fldChar w:fldCharType="end"/>
     </w:r>
+  </w:p>
+</w:ftr>
+</file>
+
+<file path=word/footer2.xml><?xml version="1.0" encoding="utf-8"?>
+<w:ftr xmlns:m="http://schemas.openxmlformats.org/officeDocument/2006/math" xmlns:mc="http://schemas.openxmlformats.org/markup-compatibility/2006" xmlns:mo="http://schemas.microsoft.com/office/mac/office/2008/main" xmlns:mv="urn:schemas-microsoft-com:mac:vml" xmlns:o="urn:schemas-microsoft-com:office:office" xmlns:r="http://schemas.openxmlformats.org/officeDocument/2006/relationships" xmlns:v="urn:schemas-microsoft-com:vml" xmlns:w10="urn:schemas-microsoft-com:office:word" xmlns:w14="http://schemas.microsoft.com/office/word/2010/wordml" xmlns:w="http://schemas.openxmlformats.org/wordprocessingml/2006/main" xmlns:wne="http://schemas.microsoft.com/office/word/2006/wordml" xmlns:wp14="http://schemas.microsoft.com/office/word/2010/wordprocessingDrawing" xmlns:wp="http://schemas.openxmlformats.org/drawingml/2006/wordprocessingDrawing" xmlns:wpc="http://schemas.microsoft.com/office/word/2010/wordprocessingCanvas" xmlns:wpg="http://schemas.microsoft.com/office/word/2010/wordprocessingGroup" xmlns:wpi="http://schemas.microsoft.com/office/word/2010/wordprocessingInk" xmlns:wps="http://schemas.microsoft.com/office/word/2010/wordprocessingShape" mc:Ignorable="w14 wp14">
+  <w:p>
+    <w:pPr>
+      <w:pStyle w:val="Footer"/>
+    </w:pPr>
+  </w:p>
+</w:ftr>
+</file>
+
+<file path=word/footer3.xml><?xml version="1.0" encoding="utf-8"?>
+<w:ftr xmlns:m="http://schemas.openxmlformats.org/officeDocument/2006/math" xmlns:mc="http://schemas.openxmlformats.org/markup-compatibility/2006" xmlns:mo="http://schemas.microsoft.com/office/mac/office/2008/main" xmlns:mv="urn:schemas-microsoft-com:mac:vml" xmlns:o="urn:schemas-microsoft-com:office:office" xmlns:r="http://schemas.openxmlformats.org/officeDocument/2006/relationships" xmlns:v="urn:schemas-microsoft-com:vml" xmlns:w10="urn:schemas-microsoft-com:office:word" xmlns:w14="http://schemas.microsoft.com/office/word/2010/wordml" xmlns:w="http://schemas.openxmlformats.org/wordprocessingml/2006/main" xmlns:wne="http://schemas.microsoft.com/office/word/2006/wordml" xmlns:wp14="http://schemas.microsoft.com/office/word/2010/wordprocessingDrawing" xmlns:wp="http://schemas.openxmlformats.org/drawingml/2006/wordprocessingDrawing" xmlns:wpc="http://schemas.microsoft.com/office/word/2010/wordprocessingCanvas" xmlns:wpg="http://schemas.microsoft.com/office/word/2010/wordprocessingGroup" xmlns:wpi="http://schemas.microsoft.com/office/word/2010/wordprocessingInk" xmlns:wps="http://schemas.microsoft.com/office/word/2010/wordprocessingShape" mc:Ignorable="w14 wp14">
+  <w:p>
+    <w:pPr>
+      <w:pStyle w:val="Footer"/>
+    </w:pPr>
   </w:p>
 </w:ftr>
 </file>

</xml_diff>